<commit_message>
estilos + limpieza de codigo
</commit_message>
<xml_diff>
--- a/docu/Memorias/memoriaEstructura.docx
+++ b/docu/Memorias/memoriaEstructura.docx
@@ -19,6 +19,34 @@
           <w:szCs w:val="52"/>
         </w:rPr>
         <w:t>PROYECTO FINAL DE GRADO – COSTURAS CON MIMO WEB VUE/DJANGO/POSTGRES</w:t>
+      </w:r>
+      <w:r>
+        <w:rPr>
+          <w:rFonts w:ascii="Aharoni" w:hAnsi="Aharoni" w:cs="Aharoni"/>
+          <w:color w:val="0F9ED5" w:themeColor="accent4"/>
+          <w:sz w:val="52"/>
+          <w:szCs w:val="52"/>
+        </w:rPr>
+        <w:t xml:space="preserve"> – </w:t>
+      </w:r>
+    </w:p>
+    <w:p>
+      <w:pPr>
+        <w:rPr>
+          <w:rFonts w:ascii="Aharoni" w:hAnsi="Aharoni" w:cs="Aharoni"/>
+          <w:color w:val="0F9ED5" w:themeColor="accent4"/>
+          <w:sz w:val="52"/>
+          <w:szCs w:val="52"/>
+        </w:rPr>
+      </w:pPr>
+      <w:r>
+        <w:rPr>
+          <w:rFonts w:ascii="Aharoni" w:hAnsi="Aharoni" w:cs="Aharoni"/>
+          <w:color w:val="0F9ED5" w:themeColor="accent4"/>
+          <w:sz w:val="52"/>
+          <w:szCs w:val="52"/>
+        </w:rPr>
+        <w:t>MEMORIA</w:t>
       </w:r>
     </w:p>
     <w:p/>
@@ -2120,21 +2148,7 @@
             <w:rStyle w:val="Hipervnculo"/>
             <w:noProof/>
           </w:rPr>
-          <w:t xml:space="preserve">Ilustración 3 Caso de </w:t>
-        </w:r>
-        <w:r>
-          <w:rPr>
-            <w:rStyle w:val="Hipervnculo"/>
-            <w:noProof/>
-          </w:rPr>
-          <w:t>u</w:t>
-        </w:r>
-        <w:r>
-          <w:rPr>
-            <w:rStyle w:val="Hipervnculo"/>
-            <w:noProof/>
-          </w:rPr>
-          <w:t>so Admin</w:t>
+          <w:t>Ilustración 3 Caso de uso Admin</w:t>
         </w:r>
         <w:r>
           <w:rPr>
@@ -2956,24 +2970,14 @@
       <w:r>
         <w:t xml:space="preserve">Ilustración </w:t>
       </w:r>
-      <w:r>
-        <w:fldChar w:fldCharType="begin"/>
-      </w:r>
-      <w:r>
-        <w:instrText xml:space="preserve"> SEQ Ilustración \* ARABIC </w:instrText>
-      </w:r>
-      <w:r>
-        <w:fldChar w:fldCharType="separate"/>
-      </w:r>
-      <w:r>
-        <w:rPr>
-          <w:noProof/>
-        </w:rPr>
-        <w:t>1</w:t>
-      </w:r>
-      <w:r>
-        <w:fldChar w:fldCharType="end"/>
-      </w:r>
+      <w:fldSimple w:instr=" SEQ Ilustración \* ARABIC ">
+        <w:r>
+          <w:rPr>
+            <w:noProof/>
+          </w:rPr>
+          <w:t>1</w:t>
+        </w:r>
+      </w:fldSimple>
       <w:r>
         <w:t xml:space="preserve"> Diagrama E/R</w:t>
       </w:r>
@@ -3106,24 +3110,14 @@
       <w:r>
         <w:t xml:space="preserve">Ilustración </w:t>
       </w:r>
-      <w:r>
-        <w:fldChar w:fldCharType="begin"/>
-      </w:r>
-      <w:r>
-        <w:instrText xml:space="preserve"> SEQ Ilustración \* ARABIC </w:instrText>
-      </w:r>
-      <w:r>
-        <w:fldChar w:fldCharType="separate"/>
-      </w:r>
-      <w:r>
-        <w:rPr>
-          <w:noProof/>
-        </w:rPr>
-        <w:t>2</w:t>
-      </w:r>
-      <w:r>
-        <w:fldChar w:fldCharType="end"/>
-      </w:r>
+      <w:fldSimple w:instr=" SEQ Ilustración \* ARABIC ">
+        <w:r>
+          <w:rPr>
+            <w:noProof/>
+          </w:rPr>
+          <w:t>2</w:t>
+        </w:r>
+      </w:fldSimple>
       <w:r>
         <w:t xml:space="preserve"> </w:t>
       </w:r>
@@ -3250,27 +3244,14 @@
       <w:r>
         <w:t xml:space="preserve">Ilustración </w:t>
       </w:r>
-      <w:r>
-        <w:fldChar w:fldCharType="begin"/>
-      </w:r>
-      <w:r>
-        <w:instrText xml:space="preserve"> SEQ Ilustración \* ARABIC </w:instrText>
-      </w:r>
-      <w:r>
-        <w:fldChar w:fldCharType="separate"/>
-      </w:r>
-      <w:r>
-        <w:rPr>
-          <w:noProof/>
-        </w:rPr>
-        <w:t>3</w:t>
-      </w:r>
-      <w:r>
-        <w:rPr>
-          <w:noProof/>
-        </w:rPr>
-        <w:fldChar w:fldCharType="end"/>
-      </w:r>
+      <w:fldSimple w:instr=" SEQ Ilustración \* ARABIC ">
+        <w:r>
+          <w:rPr>
+            <w:noProof/>
+          </w:rPr>
+          <w:t>3</w:t>
+        </w:r>
+      </w:fldSimple>
       <w:r>
         <w:t xml:space="preserve"> Caso de uso </w:t>
       </w:r>
@@ -3480,27 +3461,14 @@
       <w:r>
         <w:t xml:space="preserve">Ilustración </w:t>
       </w:r>
-      <w:r>
-        <w:fldChar w:fldCharType="begin"/>
-      </w:r>
-      <w:r>
-        <w:instrText xml:space="preserve"> SEQ Ilustración \* ARABIC </w:instrText>
-      </w:r>
-      <w:r>
-        <w:fldChar w:fldCharType="separate"/>
-      </w:r>
-      <w:r>
-        <w:rPr>
-          <w:noProof/>
-        </w:rPr>
-        <w:t>4</w:t>
-      </w:r>
-      <w:r>
-        <w:rPr>
-          <w:noProof/>
-        </w:rPr>
-        <w:fldChar w:fldCharType="end"/>
-      </w:r>
+      <w:fldSimple w:instr=" SEQ Ilustración \* ARABIC ">
+        <w:r>
+          <w:rPr>
+            <w:noProof/>
+          </w:rPr>
+          <w:t>4</w:t>
+        </w:r>
+      </w:fldSimple>
       <w:r>
         <w:t xml:space="preserve"> Diagrama de Clases</w:t>
       </w:r>
@@ -3576,27 +3544,14 @@
       <w:r>
         <w:t xml:space="preserve">Ilustración </w:t>
       </w:r>
-      <w:r>
-        <w:fldChar w:fldCharType="begin"/>
-      </w:r>
-      <w:r>
-        <w:instrText xml:space="preserve"> SEQ Ilustración \* ARABIC </w:instrText>
-      </w:r>
-      <w:r>
-        <w:fldChar w:fldCharType="separate"/>
-      </w:r>
-      <w:r>
-        <w:rPr>
-          <w:noProof/>
-        </w:rPr>
-        <w:t>5</w:t>
-      </w:r>
-      <w:r>
-        <w:rPr>
-          <w:noProof/>
-        </w:rPr>
-        <w:fldChar w:fldCharType="end"/>
-      </w:r>
+      <w:fldSimple w:instr=" SEQ Ilustración \* ARABIC ">
+        <w:r>
+          <w:rPr>
+            <w:noProof/>
+          </w:rPr>
+          <w:t>5</w:t>
+        </w:r>
+      </w:fldSimple>
       <w:r>
         <w:t xml:space="preserve"> Diagrama de estados Encargos</w:t>
       </w:r>
@@ -3658,27 +3613,14 @@
       <w:r>
         <w:t xml:space="preserve">Ilustración </w:t>
       </w:r>
-      <w:r>
-        <w:fldChar w:fldCharType="begin"/>
-      </w:r>
-      <w:r>
-        <w:instrText xml:space="preserve"> SEQ Ilustración \* ARABIC </w:instrText>
-      </w:r>
-      <w:r>
-        <w:fldChar w:fldCharType="separate"/>
-      </w:r>
-      <w:r>
-        <w:rPr>
-          <w:noProof/>
-        </w:rPr>
-        <w:t>6</w:t>
-      </w:r>
-      <w:r>
-        <w:rPr>
-          <w:noProof/>
-        </w:rPr>
-        <w:fldChar w:fldCharType="end"/>
-      </w:r>
+      <w:fldSimple w:instr=" SEQ Ilustración \* ARABIC ">
+        <w:r>
+          <w:rPr>
+            <w:noProof/>
+          </w:rPr>
+          <w:t>6</w:t>
+        </w:r>
+      </w:fldSimple>
       <w:r>
         <w:t xml:space="preserve"> </w:t>
       </w:r>
@@ -3762,24 +3704,14 @@
       <w:r>
         <w:t xml:space="preserve">Ilustración </w:t>
       </w:r>
-      <w:r>
-        <w:fldChar w:fldCharType="begin"/>
-      </w:r>
-      <w:r>
-        <w:instrText xml:space="preserve"> SEQ Ilustración \* ARABIC </w:instrText>
-      </w:r>
-      <w:r>
-        <w:fldChar w:fldCharType="separate"/>
-      </w:r>
-      <w:r>
-        <w:rPr>
-          <w:noProof/>
-        </w:rPr>
-        <w:t>7</w:t>
-      </w:r>
-      <w:r>
-        <w:fldChar w:fldCharType="end"/>
-      </w:r>
+      <w:fldSimple w:instr=" SEQ Ilustración \* ARABIC ">
+        <w:r>
+          <w:rPr>
+            <w:noProof/>
+          </w:rPr>
+          <w:t>7</w:t>
+        </w:r>
+      </w:fldSimple>
       <w:r>
         <w:t xml:space="preserve"> Diagrama de secuencia</w:t>
       </w:r>
@@ -3854,24 +3786,14 @@
       <w:r>
         <w:t xml:space="preserve">Ilustración </w:t>
       </w:r>
-      <w:r>
-        <w:fldChar w:fldCharType="begin"/>
-      </w:r>
-      <w:r>
-        <w:instrText xml:space="preserve"> SEQ Ilustración \* ARABIC </w:instrText>
-      </w:r>
-      <w:r>
-        <w:fldChar w:fldCharType="separate"/>
-      </w:r>
-      <w:r>
-        <w:rPr>
-          <w:noProof/>
-        </w:rPr>
-        <w:t>8</w:t>
-      </w:r>
-      <w:r>
-        <w:fldChar w:fldCharType="end"/>
-      </w:r>
+      <w:fldSimple w:instr=" SEQ Ilustración \* ARABIC ">
+        <w:r>
+          <w:rPr>
+            <w:noProof/>
+          </w:rPr>
+          <w:t>8</w:t>
+        </w:r>
+      </w:fldSimple>
       <w:r>
         <w:t xml:space="preserve"> Diagrama de paquetes</w:t>
       </w:r>
@@ -3944,24 +3866,14 @@
       <w:r>
         <w:t xml:space="preserve">Ilustración </w:t>
       </w:r>
-      <w:r>
-        <w:fldChar w:fldCharType="begin"/>
-      </w:r>
-      <w:r>
-        <w:instrText xml:space="preserve"> SEQ Ilustración \* ARABIC </w:instrText>
-      </w:r>
-      <w:r>
-        <w:fldChar w:fldCharType="separate"/>
-      </w:r>
-      <w:r>
-        <w:rPr>
-          <w:noProof/>
-        </w:rPr>
-        <w:t>9</w:t>
-      </w:r>
-      <w:r>
-        <w:fldChar w:fldCharType="end"/>
-      </w:r>
+      <w:fldSimple w:instr=" SEQ Ilustración \* ARABIC ">
+        <w:r>
+          <w:rPr>
+            <w:noProof/>
+          </w:rPr>
+          <w:t>9</w:t>
+        </w:r>
+      </w:fldSimple>
       <w:r>
         <w:t xml:space="preserve"> Diagrama de objetos</w:t>
       </w:r>
@@ -3972,6 +3884,7 @@
       <w:pgSz w:w="11906" w:h="16838"/>
       <w:pgMar w:top="1417" w:right="1701" w:bottom="1417" w:left="1701" w:header="708" w:footer="708" w:gutter="0"/>
       <w:cols w:space="708"/>
+      <w:titlePg/>
       <w:docGrid w:linePitch="360"/>
     </w:sectPr>
   </w:body>
@@ -4089,6 +4002,9 @@
     </w:pPr>
     <w:r>
       <w:t>Costuras con Mimo</w:t>
+    </w:r>
+    <w:r>
+      <w:t>: Memoria</w:t>
     </w:r>
     <w:r>
       <w:tab/>
@@ -5090,6 +5006,7 @@
   <w:style w:type="character" w:default="1" w:styleId="Fuentedeprrafopredeter">
     <w:name w:val="Default Paragraph Font"/>
     <w:uiPriority w:val="1"/>
+    <w:semiHidden/>
     <w:unhideWhenUsed/>
   </w:style>
   <w:style w:type="table" w:default="1" w:styleId="Tablanormal">

</xml_diff>